<commit_message>
docs: note legali e prompt Claude Code su revoca manuale e video di dichiarazione, libreria documenti aggiornata
</commit_message>
<xml_diff>
--- a/public/documenti/1-accordo-editoriale.docx
+++ b/public/documenti/1-accordo-editoriale.docx
@@ -131,7 +131,7 @@
           <w:sz w:val="20"/>
           <w:szCs w:val="20"/>
         </w:rPr>
-        <w:t xml:space="preserve">Il/La sottoscritto/a [Nome e Cognome], nato/a a [Luogo] il [Data], residente in [Indirizzo], C.F. [codice fiscale], studente/ssa del Corso di Laurea Magistrale in Odontoiatria e Protesi Dentaria presso l'Università degli Studi di [Ateneo] di matricola n. [numero] (di seguito "il Collaboratore")</w:t>
+        <w:t xml:space="preserve">Il/La sottoscritto/a ________________________________, nato/a a ________________ il ____________, residente in ________________________________________, C.F. ________________________________, studente/ssa del Corso di Laurea Magistrale in Odontoiatria e Protesi Dentaria presso l'Università degli Studi di ________________________ di matricola n. ____________ (di seguito "il Collaboratore")</w:t>
       </w:r>
     </w:p>
     <w:p>
@@ -743,7 +743,7 @@
           <w:sz w:val="20"/>
           <w:szCs w:val="20"/>
         </w:rPr>
-        <w:t xml:space="preserve">raccogliere, in apertura di ogni ripresa che coinvolga una persona esterna (intervistato, professore, passante, professionista), la dichiarazione a video del nome, cognome e recapito (email o PEC) della persona, cui verrà inviata la liberatoria digitale da firmare. La registrazione di tale dichiarazione deve avvenire senza soluzione di continuità rispetto all'intervista, in un unico file, in modo da saldare indissolubilmente l'identità dichiarata al contenuto dell'intervista;</w:t>
+        <w:t xml:space="preserve">registrare, prima di ogni intervista che coinvolga una persona esterna (intervistato, professore, passante, professionista), un video di dichiarazione a sé stante in cui la persona dichiara nome, cognome, recapito (email o PEC) e le domande specifiche a cui sta per rispondere — le stesse che risulteranno nello script consegnato — secondo le modalità descritte nel Protocollo Operativo (Art. 4.1);</w:t>
       </w:r>
     </w:p>
     <w:p>
@@ -799,7 +799,7 @@
           <w:sz w:val="20"/>
           <w:szCs w:val="20"/>
         </w:rPr>
-        <w:t xml:space="preserve">prendere atto che la dichiarazione di identità e recapito, registrata in apertura di ripresa, è finalizzata esclusivamente all'invio della liberatoria tramite gestionale e sarà rimossa dal Coordinatore in fase di montaggio, non essendo oggetto di pubblicazione. L'eventuale pubblicazione dell'immagine e della voce dell'intervistato non include il recapito dichiarato.</w:t>
+        <w:t xml:space="preserve">prendere atto che il video di dichiarazione non viene mai incluso nel contenuto pubblicato: resta un elemento separato del pacchetto da sigillare, non pubblicato, con accesso riservato a chi lo ha caricato e al Coordinatore, quale prova della dichiarazione di consenso resa dall'intervistato ai sensi degli artt. 5(2) e 7(1) GDPR (onere della prova del consenso in capo al Titolare). L'eventuale pubblicazione dell'immagine e della voce dell'intervistato non include mai il recapito dichiarato.</w:t>
       </w:r>
     </w:p>
     <w:p>
@@ -1013,407 +1013,7 @@
           <w:sz w:val="20"/>
           <w:szCs w:val="20"/>
         </w:rPr>
-        <w:t xml:space="preserve">7.2. Il Collaboratore prende atto di aver ricevuto l'informativa sul trattamento dei propri dati personali quale soggetto ripreso, contenuta nell'Informativa privacy del gestionale, sezione "Consenso per chi appare nei contenuti", ivi inclusi i diritti dell'interessato di cui agli artt. 15-22 GDPR.</w:t>
-      </w:r>
-    </w:p>
-    <w:p>
-      <w:pPr>
-        <w:spacing w:after="70"/>
-        <w:ind w:left="400" w:hanging="400"/>
-      </w:pPr>
-      <w:r>
-        <w:rPr>
-          <w:color w:val="222222"/>
-          <w:sz w:val="20"/>
-          <w:szCs w:val="20"/>
-        </w:rPr>
-        <w:t xml:space="preserve">7.3. Il Collaboratore dichiara di essere consapevole che, qualora la sua partecipazione al Progetto termini, la revoca del consenso al trattamento della propria immagine e voce comporta la cancellazione dei materiali video/audio grezzi che lo ritraggono, secondo la procedura descritta nel Protocollo Operativo, fermo restando quanto già pubblicato conformemente all'art. 17, par. 3, lett. a) del GDPR.</w:t>
-      </w:r>
-    </w:p>
-    <w:p>
-      <w:pPr>
-        <w:spacing w:after="70"/>
-        <w:ind w:left="400" w:hanging="400"/>
-      </w:pPr>
-      <w:r>
-        <w:rPr>
-          <w:color w:val="222222"/>
-          <w:sz w:val="20"/>
-          <w:szCs w:val="20"/>
-        </w:rPr>
-        <w:t xml:space="preserve">7.4. Il materiale grezzo non pubblicato che ritrae il Collaboratore, conservato nel gestionale, viene cancellato dal Coordinatore entro 30 (trenta) giorni dalla cessazione della collaborazione, salvo diversa richiesta del Collaboratore pervenuta entro tale termine.</w:t>
-      </w:r>
-    </w:p>
-    <w:p>
-      <w:pPr>
-        <w:spacing w:after="70" w:before="170"/>
-      </w:pPr>
-      <w:r>
-        <w:rPr>
-          <w:b/>
-          <w:bCs/>
-          <w:color w:val="172837"/>
-          <w:sz w:val="24"/>
-          <w:szCs w:val="24"/>
-        </w:rPr>
-        <w:t xml:space="preserve">Art. 8 — Pubblicazione, revoca del consenso e rimozione dei contenuti</w:t>
-      </w:r>
-    </w:p>
-    <w:p>
-      <w:pPr>
-        <w:spacing w:after="70"/>
-        <w:ind w:left="400" w:hanging="400"/>
-      </w:pPr>
-      <w:r>
-        <w:rPr>
-          <w:color w:val="222222"/>
-          <w:sz w:val="20"/>
-          <w:szCs w:val="20"/>
-        </w:rPr>
-        <w:t xml:space="preserve">8.1. Revoca del consenso: il Collaboratore riconosce che il consenso al trattamento dei propri dati personali (immagine, voce, nome) è sempre revocabile in qualsiasi momento, senza obbligo di indicarne il motivo, mediante comunicazione scritta al Coordinatore. La revoca del consenso non pregiudica la liceità del trattamento basata sul consenso prima della revoca.</w:t>
-      </w:r>
-    </w:p>
-    <w:p>
-      <w:pPr>
-        <w:spacing w:after="90"/>
-        <w:ind w:left="400" w:hanging="400"/>
-      </w:pPr>
-      <w:r>
-        <w:rPr>
-          <w:b w:val="false"/>
-          <w:bCs w:val="false"/>
-          <w:i w:val="false"/>
-          <w:iCs w:val="false"/>
-          <w:color w:val="222222"/>
-          <w:sz w:val="20"/>
-          <w:szCs w:val="20"/>
-        </w:rPr>
-        <w:t xml:space="preserve">8.2. Effetti della revoca: dalla ricezione della revoca, il Coordinatore cessa di utilizzare l'immagine, la voce e le dichiarazioni del Collaboratore per la realizzazione e la pubblicazione di nuovi contenuti. Il materiale grezzo non pubblicato viene cancellato secondo la procedura di cui agli artt. 7.3 e 7.4, senza necessità di ulteriore richiesta. </w:t>
-      </w:r>
-      <w:r>
-        <w:rPr>
-          <w:b/>
-          <w:bCs/>
-          <w:i w:val="false"/>
-          <w:iCs w:val="false"/>
-          <w:color w:val="222222"/>
-          <w:sz w:val="20"/>
-          <w:szCs w:val="20"/>
-        </w:rPr>
-        <w:t xml:space="preserve">La revoca non comporta invece, di per sé, la rimozione dei contenuti già pubblicati alla data della revoca: il Coordinatore ne dà atto al Collaboratore entro 30 (trenta) giorni dalla ricezione della revoca, informandolo della facoltà di chiederne la rimozione ai sensi dell'Art. 8.3. Qualora la comunicazione di revoca contenga essa stessa, anche implicitamente, una richiesta di rimozione dei contenuti già pubblicati, il Coordinatore avvia comunque la valutazione di cui all'Art. 8.3, senza attendere un'ulteriore richiesta separata.</w:t>
-      </w:r>
-    </w:p>
-    <w:p>
-      <w:pPr>
-        <w:spacing w:after="90"/>
-        <w:ind w:left="400" w:hanging="400"/>
-      </w:pPr>
-      <w:r>
-        <w:rPr>
-          <w:b w:val="false"/>
-          <w:bCs w:val="false"/>
-          <w:i w:val="false"/>
-          <w:iCs w:val="false"/>
-          <w:color w:val="222222"/>
-          <w:sz w:val="20"/>
-          <w:szCs w:val="20"/>
-        </w:rPr>
-        <w:t xml:space="preserve">8.3. Richiesta di rimozione di un contenuto già pubblicato: il Collaboratore, consapevole dell'impegno editoriale e organizzativo del Progetto, riconosce che la richiesta di rimozione di un contenuto già pubblicato è valutata caso per caso, alla luce delle finalità editoriali del Progetto e delle eccezioni previste dall'art. 17, par. 3, lett. a) del GDPR (libertà di espressione e informazione). </w:t>
-      </w:r>
-      <w:r>
-        <w:rPr>
-          <w:b/>
-          <w:bCs/>
-          <w:i w:val="false"/>
-          <w:iCs w:val="false"/>
-          <w:color w:val="222222"/>
-          <w:sz w:val="20"/>
-          <w:szCs w:val="20"/>
-        </w:rPr>
-        <w:t xml:space="preserve">Il Coordinatore, ricevuta la richiesta di rimozione, valuterà se ricorra una delle eccezioni di cui all'art. 17, par. 3, GDPR. In assenza di tali eccezioni, il Coordinatore provvederà alla rimozione o all'oscuramento (camuffamento di volto/voce) del contenuto entro 30 (trenta) giorni, dandone comunicazione all'interessato. Qualora ricorra un'eccezione, il Coordinatore fornirà risposta motivata entro lo stesso termine. Il termine di 30 giorni è prorogabile a 90 (novanta) giorni con motivazione scritta, in relazione alla complessità della valutazione.</w:t>
-      </w:r>
-    </w:p>
-    <w:p>
-      <w:pPr>
-        <w:spacing w:after="70" w:before="170"/>
-      </w:pPr>
-      <w:r>
-        <w:rPr>
-          <w:b/>
-          <w:bCs/>
-          <w:color w:val="172837"/>
-          <w:sz w:val="24"/>
-          <w:szCs w:val="24"/>
-        </w:rPr>
-        <w:t xml:space="preserve">Art. 9 — Durata e risoluzione</w:t>
-      </w:r>
-    </w:p>
-    <w:p>
-      <w:pPr>
-        <w:spacing w:after="90"/>
-        <w:ind w:left="400" w:hanging="400"/>
-      </w:pPr>
-      <w:r>
-        <w:rPr>
-          <w:b/>
-          <w:bCs/>
-          <w:i w:val="false"/>
-          <w:iCs w:val="false"/>
-          <w:color w:val="222222"/>
-          <w:sz w:val="20"/>
-          <w:szCs w:val="20"/>
-        </w:rPr>
-        <w:t xml:space="preserve">9.1. Il presente accordo ha durata fissa di 6 (sei) mesi a decorrere dalla data di sottoscrizione, rinnovabile per ulteriori periodi di 6 mesi previo accordo scritto tra le parti. In assenza di tale accordo scritto, il rapporto si intende cessato alla naturale scadenza, senza necessità di alcuna comunicazione. Ciascuna Parte può inoltre interrompere la collaborazione in qualsiasi momento, senza necessità di motivazione né di preavviso, mediante comunicazione al Coordinatore tramite l'apposita funzione del gestionale (che registra data e ora in modo inalterabile), PEC o email.</w:t>
-      </w:r>
-    </w:p>
-    <w:p>
-      <w:pPr>
-        <w:spacing w:after="70"/>
-        <w:ind w:left="400" w:hanging="400"/>
-      </w:pPr>
-      <w:r>
-        <w:rPr>
-          <w:color w:val="222222"/>
-          <w:sz w:val="20"/>
-          <w:szCs w:val="20"/>
-        </w:rPr>
-        <w:t xml:space="preserve">9.2. In caso di recesso, il Collaboratore si impegna a collaborare, per quanto ragionevolmente possibile, a una transizione ordinata dei contenuti in corso di realizzazione al momento del recesso.</w:t>
-      </w:r>
-    </w:p>
-    <w:p>
-      <w:pPr>
-        <w:spacing w:after="70"/>
-        <w:ind w:left="400" w:hanging="400"/>
-      </w:pPr>
-      <w:r>
-        <w:rPr>
-          <w:color w:val="222222"/>
-          <w:sz w:val="20"/>
-          <w:szCs w:val="20"/>
-        </w:rPr>
-        <w:t xml:space="preserve">9.3. Anche il Coordinatore può interrompere la collaborazione con un singolo Collaboratore in qualsiasi momento, con comunicazione scritta, senza necessità di indicare un inadempimento specifico.</w:t>
-      </w:r>
-    </w:p>
-    <w:p>
-      <w:pPr>
-        <w:spacing w:after="70"/>
-        <w:ind w:left="400" w:hanging="400"/>
-      </w:pPr>
-      <w:r>
-        <w:rPr>
-          <w:color w:val="222222"/>
-          <w:sz w:val="20"/>
-          <w:szCs w:val="20"/>
-        </w:rPr>
-        <w:t xml:space="preserve">9.4. Alla scadenza naturale del termine di cui all'art. 9.1, o in caso di cessazione anticipata ai sensi del presente articolo, il Collaboratore procede alla cancellazione definitiva di qualsiasi copia locale dei materiali grezzi, dei recapiti e degli altri dati personali di terzi ancora in suo possesso, entro 24 (ventiquattro) ore dalla data di cessazione, dandone comunicazione al Coordinatore.</w:t>
-      </w:r>
-    </w:p>
-    <w:p>
-      <w:pPr>
-        <w:spacing w:after="70" w:before="170"/>
-      </w:pPr>
-      <w:r>
-        <w:rPr>
-          <w:b/>
-          <w:bCs/>
-          <w:color w:val="172837"/>
-          <w:sz w:val="24"/>
-          <w:szCs w:val="24"/>
-        </w:rPr>
-        <w:t xml:space="preserve">Art. 10 — Comunicazioni</w:t>
-      </w:r>
-    </w:p>
-    <w:p>
-      <w:pPr>
-        <w:spacing w:after="70"/>
-        <w:ind w:left="400" w:hanging="400"/>
-      </w:pPr>
-      <w:r>
-        <w:rPr>
-          <w:color w:val="222222"/>
-          <w:sz w:val="20"/>
-          <w:szCs w:val="20"/>
-        </w:rPr>
-        <w:t xml:space="preserve">10.1. Tutte le comunicazioni tra le parti relative al presente accordo (incluse le richieste di recesso, risoluzione, rettifica dei dati) potranno essere effettuate tramite la funzione del gestionale, tramite Posta Elettronica Certificata (PEC) o tramite posta elettronica ordinaria, secondo il recapito registrato da ciascuna parte presso il Progetto.</w:t>
-      </w:r>
-    </w:p>
-    <w:p>
-      <w:pPr>
-        <w:spacing w:after="70"/>
-        <w:ind w:left="400" w:hanging="400"/>
-      </w:pPr>
-      <w:r>
-        <w:rPr>
-          <w:color w:val="222222"/>
-          <w:sz w:val="20"/>
-          <w:szCs w:val="20"/>
-        </w:rPr>
-        <w:t xml:space="preserve">10.2. La PEC non è obbligatoria per il Collaboratore. Il Collaboratore può comunicare tramite il proprio indirizzo email personale; l'uso della PEC è facoltativo e riservato a chi intenda avvalersi della certificazione di consegna.</w:t>
-      </w:r>
-    </w:p>
-    <w:p>
-      <w:pPr>
-        <w:spacing w:after="70" w:before="170"/>
-      </w:pPr>
-      <w:r>
-        <w:rPr>
-          <w:b/>
-          <w:bCs/>
-          <w:color w:val="172837"/>
-          <w:sz w:val="24"/>
-          <w:szCs w:val="24"/>
-        </w:rPr>
-        <w:t xml:space="preserve">Art. 11 — Responsabilità civile verso terzi</w:t>
-      </w:r>
-    </w:p>
-    <w:p>
-      <w:pPr>
-        <w:spacing w:after="70"/>
-        <w:ind w:left="400" w:hanging="400"/>
-      </w:pPr>
-      <w:r>
-        <w:rPr>
-          <w:color w:val="222222"/>
-          <w:sz w:val="20"/>
-          <w:szCs w:val="20"/>
-        </w:rPr>
-        <w:t xml:space="preserve">11.1. Il Collaboratore dichiara di essere consapevole che, nello svolgimento delle attività di ripresa e intervista, potrebbe entrare in contatto con terzi e beni, e si impegna a prestare la massima diligenza e cautela, conformemente all'art. 1176 del Codice Civile.</w:t>
-      </w:r>
-    </w:p>
-    <w:p>
-      <w:pPr>
-        <w:spacing w:after="70"/>
-        <w:ind w:left="400" w:hanging="400"/>
-      </w:pPr>
-      <w:r>
-        <w:rPr>
-          <w:color w:val="222222"/>
-          <w:sz w:val="20"/>
-          <w:szCs w:val="20"/>
-        </w:rPr>
-        <w:t xml:space="preserve">11.2. Il Progetto non risponde dei danni cagionati a terzi dal Collaboratore, fatti salvi i casi di colpa grave o dolo del Coordinatore. Il Collaboratore si obbliga a tenere indenne e manlevare il Progetto da eventuali pretese risarcitorie avanzate da terzi per fatti a lui imputabili nello svolgimento delle attività di cui al presente accordo.</w:t>
-      </w:r>
-    </w:p>
-    <w:p>
-      <w:pPr>
-        <w:spacing w:after="70"/>
-        <w:ind w:left="400" w:hanging="400"/>
-      </w:pPr>
-      <w:r>
-        <w:rPr>
-          <w:color w:val="222222"/>
-          <w:sz w:val="20"/>
-          <w:szCs w:val="20"/>
-        </w:rPr>
-        <w:t xml:space="preserve">11.3. Il Collaboratore è consapevole che il Progetto non fornisce copertura assicurativa per la responsabilità civile verso terzi, e che eventuali sinistri occorsi durante le attività di ripresa restano di esclusiva responsabilità del Collaboratore stesso.</w:t>
-      </w:r>
-    </w:p>
-    <w:p>
-      <w:pPr>
-        <w:spacing w:after="40" w:before="110"/>
-      </w:pPr>
-      <w:r>
-        <w:rPr>
-          <w:b/>
-          <w:bCs/>
-          <w:color w:val="172837"/>
-          <w:sz w:val="20"/>
-          <w:szCs w:val="20"/>
-        </w:rPr>
-        <w:t xml:space="preserve">DISPOSIZIONI A TUTELA DEL PROGETTO</w:t>
-      </w:r>
-    </w:p>
-    <w:p>
-      <w:pPr>
-        <w:spacing w:after="70" w:before="170"/>
-      </w:pPr>
-      <w:r>
-        <w:rPr>
-          <w:b/>
-          <w:bCs/>
-          <w:color w:val="172837"/>
-          <w:sz w:val="24"/>
-          <w:szCs w:val="24"/>
-        </w:rPr>
-        <w:t xml:space="preserve">Art. 12 — Marchio, denominazione e materiali del Progetto</w:t>
-      </w:r>
-    </w:p>
-    <w:p>
-      <w:pPr>
-        <w:spacing w:after="70"/>
-        <w:ind w:left="400" w:hanging="400"/>
-      </w:pPr>
-      <w:r>
-        <w:rPr>
-          <w:color w:val="222222"/>
-          <w:sz w:val="20"/>
-          <w:szCs w:val="20"/>
-        </w:rPr>
-        <w:t xml:space="preserve">12.1. Il presente accordo non attribuisce al Collaboratore alcun diritto di proprietà o di uso esclusivo sulla denominazione "</w:t>
-      </w:r>
-      <w:r>
-        <w:rPr>
-          <w:color w:val="222222"/>
-          <w:sz w:val="20"/>
-          <w:szCs w:val="20"/>
-        </w:rPr>
-        <w:t xml:space="preserve">Tooth Talk</w:t>
-      </w:r>
-      <w:r>
-        <w:rPr>
-          <w:color w:val="222222"/>
-          <w:sz w:val="20"/>
-          <w:szCs w:val="20"/>
-          <w:vertAlign w:val="superscript"/>
-        </w:rPr>
-        <w:t xml:space="preserve">™</w:t>
-      </w:r>
-      <w:r>
-        <w:rPr>
-          <w:color w:val="222222"/>
-          <w:sz w:val="20"/>
-          <w:szCs w:val="20"/>
-        </w:rPr>
-        <w:t xml:space="preserve">", sul marchio figurativo registrato all'Ufficio Italiano Brevetti e Marchi al n. 302025000163999, sul marchio denominativo "</w:t>
-      </w:r>
-      <w:r>
-        <w:rPr>
-          <w:color w:val="222222"/>
-          <w:sz w:val="20"/>
-          <w:szCs w:val="20"/>
-        </w:rPr>
-        <w:t xml:space="preserve">Tooth Talk</w:t>
-      </w:r>
-      <w:r>
-        <w:rPr>
-          <w:color w:val="222222"/>
-          <w:sz w:val="20"/>
-          <w:szCs w:val="20"/>
-          <w:vertAlign w:val="superscript"/>
-        </w:rPr>
-        <w:t xml:space="preserve">™</w:t>
-      </w:r>
-      <w:r>
-        <w:rPr>
-          <w:color w:val="222222"/>
-          <w:sz w:val="20"/>
-          <w:szCs w:val="20"/>
-        </w:rPr>
-        <w:t xml:space="preserve">" (in corso di registrazione presso il medesimo Ufficio), sui format o sui canali del Progetto.</w:t>
-      </w:r>
-    </w:p>
-    <w:p>
-      <w:pPr>
-        <w:spacing w:after="70"/>
-        <w:ind w:left="400" w:hanging="400"/>
-      </w:pPr>
-      <w:r>
-        <w:rPr>
-          <w:color w:val="222222"/>
-          <w:sz w:val="20"/>
-          <w:szCs w:val="20"/>
-        </w:rPr>
-        <w:t xml:space="preserve">12.2. Senza autorizzazione scritta del Coordinatore, il Collaboratore non può:</w:t>
+        <w:t xml:space="preserve">7.2. Il Collaboratore, con la sottoscrizione del presente Accordo, prende atto ed acconsente specificamente che, in quanto soggetto ripreso nei contenuti:</w:t>
       </w:r>
     </w:p>
     <w:p>
@@ -1431,32 +1031,7 @@
           <w:sz w:val="20"/>
           <w:szCs w:val="20"/>
         </w:rPr>
-        <w:t xml:space="preserve">aprire profili o pagine utilizzando il nome o il logo "</w:t>
-      </w:r>
-      <w:r>
-        <w:rPr>
-          <w:color w:val="222222"/>
-          <w:sz w:val="20"/>
-          <w:szCs w:val="20"/>
-        </w:rPr>
-        <w:t xml:space="preserve">Tooth Talk</w:t>
-      </w:r>
-      <w:r>
-        <w:rPr>
-          <w:color w:val="222222"/>
-          <w:sz w:val="20"/>
-          <w:szCs w:val="20"/>
-          <w:vertAlign w:val="superscript"/>
-        </w:rPr>
-        <w:t xml:space="preserve">™</w:t>
-      </w:r>
-      <w:r>
-        <w:rPr>
-          <w:color w:val="222222"/>
-          <w:sz w:val="20"/>
-          <w:szCs w:val="20"/>
-        </w:rPr>
-        <w:t xml:space="preserve">";</w:t>
+        <w:t xml:space="preserve">i contenuti che lo ritraggono potranno essere registrati, riprodotti, distribuiti, comunicati al pubblico e diffusi sui canali del Progetto di cui all'Art. 1.1;</w:t>
       </w:r>
     </w:p>
     <w:p>
@@ -1474,7 +1049,7 @@
           <w:sz w:val="20"/>
           <w:szCs w:val="20"/>
         </w:rPr>
-        <w:t xml:space="preserve">registrare domini, marchi o segni simili o confondibili con quelli del Progetto;</w:t>
+        <w:t xml:space="preserve">i contenuti potranno essere modificati, montati, adattati e integrati con altri materiali, nel rispetto della finalità editoriale del Progetto;</w:t>
       </w:r>
     </w:p>
     <w:p>
@@ -1492,7 +1067,7 @@
           <w:sz w:val="20"/>
           <w:szCs w:val="20"/>
         </w:rPr>
-        <w:t xml:space="preserve">concedere a terzi l'uso dei materiali del Progetto;</w:t>
+        <w:t xml:space="preserve">non è previsto alcun compenso o rimborso spese, né un diritto di controllo preventivo sui contenuti editati;</w:t>
       </w:r>
     </w:p>
     <w:p>
@@ -1506,11 +1081,434 @@
       </w:pPr>
       <w:r>
         <w:rPr>
-          <w:color w:val="222222"/>
-          <w:sz w:val="20"/>
-          <w:szCs w:val="20"/>
-        </w:rPr>
-        <w:t xml:space="preserve">pubblicare autonomamente contenuti non ancora approvati secondo la procedura di sigillo di cui al Protocollo Operativo;</w:t>
+          <w:b/>
+          <w:bCs/>
+          <w:color w:val="222222"/>
+          <w:sz w:val="20"/>
+          <w:szCs w:val="20"/>
+        </w:rPr>
+        <w:t xml:space="preserve">le dichiarazioni rese nei contenuti sono di esclusiva responsabilità di chi le rende: il Collaboratore dichiara che le proprie dichiarazioni sono veritiere, accurate e non diffamatorie nei confronti di terzi, e si impegna a manlevare e tenere indenne il Progetto da qualsiasi pretesa di terzi al riguardo, fatta salva l'ipotesi di montaggio palesemente manipolatorio da parte del Progetto che ne stravolga il senso.</w:t>
+      </w:r>
+    </w:p>
+    <w:p>
+      <w:pPr>
+        <w:spacing w:after="90"/>
+      </w:pPr>
+      <w:r>
+        <w:rPr>
+          <w:color w:val="222222"/>
+          <w:sz w:val="20"/>
+          <w:szCs w:val="20"/>
+        </w:rPr>
+        <w:t xml:space="preserve">Il Collaboratore prende inoltre atto di aver ricevuto per esteso l'informativa sul trattamento dei propri dati personali quale soggetto ripreso — la cui versione integrale, sempre consultabile, resta pubblicata nell'Informativa privacy del gestionale, sezione "Consenso per chi appare nei contenuti" — ivi inclusi i diritti dell'interessato di cui agli artt. 15-22 GDPR.</w:t>
+      </w:r>
+    </w:p>
+    <w:p>
+      <w:pPr>
+        <w:spacing w:after="70"/>
+        <w:ind w:left="400" w:hanging="400"/>
+      </w:pPr>
+      <w:r>
+        <w:rPr>
+          <w:color w:val="222222"/>
+          <w:sz w:val="20"/>
+          <w:szCs w:val="20"/>
+        </w:rPr>
+        <w:t>7.3. Il Collaboratore dichiara di essere consapevole che, qualora la sua partecipazione al Progetto termini, la revoca del consenso al trattamento della propria immagine e voce comporta l'individuazione e la cancellazione dei materiali video/audio grezzi che lo ritraggono, secondo la procedura descritta al successivo Art. 7.4, fermo restando quanto già pubblicato conformemente all'art. 17, par. 3, lett. a) del GDPR.</w:t>
+      </w:r>
+    </w:p>
+    <w:p>
+      <w:pPr>
+        <w:spacing w:after="70"/>
+        <w:ind w:left="400" w:hanging="400"/>
+      </w:pPr>
+      <w:r>
+        <w:rPr>
+          <w:color w:val="222222"/>
+          <w:sz w:val="20"/>
+          <w:szCs w:val="20"/>
+        </w:rPr>
+        <w:t xml:space="preserve">7.4. Il materiale grezzo non pubblicato che ritrae il Collaboratore viene individuato ed eliminato manualmente dal Coordinatore entro 30 (trenta) giorni dalla revoca (o dalla cessazione della collaborazione). </w:t>
+      </w:r>
+      <w:r>
+        <w:rPr>
+          <w:b/>
+          <w:color w:val="222222"/>
+          <w:sz w:val="20"/>
+        </w:rPr>
+        <w:t>La cancellazione non è, e non può essere, automatica: il gestionale registra chi ha caricato un file, non chi vi compare. Uno stesso file può ritrarre più persone contemporaneamente — un Collaboratore che ha caricato un girato può comparire in esso insieme a un altro Collaboratore che non ha revocato alcun consenso. Una cancellazione automatica basata su chi ha caricato il file rischierebbe di eliminare anche materiale che riguarda terzi che non hanno chiesto nulla. Per questo l'individuazione dei file da eliminare è sempre una verifica umana del Coordinatore, non un'azione automatica del sistema.</w:t>
+      </w:r>
+    </w:p>
+    <w:p>
+      <w:pPr>
+        <w:spacing w:after="70" w:before="170"/>
+      </w:pPr>
+      <w:r>
+        <w:rPr>
+          <w:b/>
+          <w:bCs/>
+          <w:color w:val="172837"/>
+          <w:sz w:val="24"/>
+          <w:szCs w:val="24"/>
+        </w:rPr>
+        <w:t xml:space="preserve">Art. 8 — Pubblicazione, revoca del consenso e rimozione dei contenuti</w:t>
+      </w:r>
+    </w:p>
+    <w:p>
+      <w:pPr>
+        <w:spacing w:after="70"/>
+        <w:ind w:left="400" w:hanging="400"/>
+      </w:pPr>
+      <w:r>
+        <w:rPr>
+          <w:color w:val="222222"/>
+          <w:sz w:val="20"/>
+          <w:szCs w:val="20"/>
+        </w:rPr>
+        <w:t xml:space="preserve">8.1. Revoca del consenso: il Collaboratore riconosce che il consenso al trattamento dei propri dati personali (immagine, voce, nome) è sempre revocabile in qualsiasi momento, senza obbligo di indicarne il motivo, mediante l'apposita funzione di revoca disponibile nel proprio profilo del gestionale — che costituisce comunicazione scritta a tutti gli effetti e ne conserva traccia con data e ora — oppure, in alternativa, mediante comunicazione scritta diretta al Coordinatore. La revoca del consenso non pregiudica la liceità del trattamento basata sul consenso prima della revoca.</w:t>
+      </w:r>
+    </w:p>
+    <w:p>
+      <w:pPr>
+        <w:spacing w:after="90"/>
+        <w:ind w:left="400" w:hanging="400"/>
+      </w:pPr>
+      <w:r>
+        <w:rPr>
+          <w:b w:val="false"/>
+          <w:bCs w:val="false"/>
+          <w:i w:val="false"/>
+          <w:iCs w:val="false"/>
+          <w:color w:val="222222"/>
+          <w:sz w:val="20"/>
+          <w:szCs w:val="20"/>
+        </w:rPr>
+        <w:t xml:space="preserve">8.2. Effetti della revoca: dalla ricezione della revoca, il Coordinatore cessa di utilizzare l'immagine, la voce e le dichiarazioni del Collaboratore per la realizzazione e la pubblicazione di nuovi contenuti. Il materiale grezzo non pubblicato viene individuato ed eliminato secondo la procedura di cui agli artt. 7.3 e 7.4, senza necessità di ulteriore richiesta da parte del Collaboratore — ma sempre a seguito di verifica manuale del Coordinatore, mai in automatico (Art. 7.4). </w:t>
+      </w:r>
+      <w:r>
+        <w:rPr>
+          <w:b/>
+          <w:bCs/>
+          <w:i w:val="false"/>
+          <w:iCs w:val="false"/>
+          <w:color w:val="222222"/>
+          <w:sz w:val="20"/>
+          <w:szCs w:val="20"/>
+        </w:rPr>
+        <w:t xml:space="preserve">La revoca non comporta invece, di per sé, la rimozione dei contenuti già pubblicati alla data della revoca: il Coordinatore ne dà atto al Collaboratore entro 30 (trenta) giorni dalla ricezione della revoca, informandolo della facoltà di chiederne la rimozione ai sensi dell'Art. 8.3. Qualora la comunicazione di revoca contenga essa stessa, anche implicitamente, una richiesta di rimozione dei contenuti già pubblicati, il Coordinatore avvia comunque la valutazione di cui all'Art. 8.3, senza attendere un'ulteriore richiesta separata.</w:t>
+      </w:r>
+    </w:p>
+    <w:p>
+      <w:pPr>
+        <w:spacing w:after="90"/>
+        <w:ind w:left="400" w:hanging="400"/>
+      </w:pPr>
+      <w:r>
+        <w:rPr>
+          <w:b w:val="false"/>
+          <w:bCs w:val="false"/>
+          <w:i w:val="false"/>
+          <w:iCs w:val="false"/>
+          <w:color w:val="222222"/>
+          <w:sz w:val="20"/>
+          <w:szCs w:val="20"/>
+        </w:rPr>
+        <w:t xml:space="preserve">8.3. Richiesta di rimozione di un contenuto già pubblicato: il Collaboratore, consapevole dell'impegno editoriale e organizzativo del Progetto, riconosce che la richiesta di rimozione di un contenuto già pubblicato è valutata caso per caso, alla luce delle finalità editoriali del Progetto e delle eccezioni previste dall'art. 17, par. 3, lett. a) del GDPR (libertà di espressione e informazione). </w:t>
+      </w:r>
+      <w:r>
+        <w:rPr>
+          <w:b/>
+          <w:bCs/>
+          <w:i w:val="false"/>
+          <w:iCs w:val="false"/>
+          <w:color w:val="222222"/>
+          <w:sz w:val="20"/>
+          <w:szCs w:val="20"/>
+        </w:rPr>
+        <w:t xml:space="preserve">Il Coordinatore, ricevuta la richiesta di rimozione, valuterà se ricorra una delle eccezioni di cui all'art. 17, par. 3, GDPR. In assenza di tali eccezioni, il Coordinatore provvederà alla rimozione o all'oscuramento (camuffamento di volto/voce) del contenuto entro 30 (trenta) giorni, dandone comunicazione all'interessato. Qualora ricorra un'eccezione, il Coordinatore fornirà risposta motivata entro lo stesso termine. Il termine di 30 giorni è prorogabile a 90 (novanta) giorni con motivazione scritta, in relazione alla complessità della valutazione.</w:t>
+      </w:r>
+    </w:p>
+    <w:p>
+      <w:pPr>
+        <w:spacing w:after="70" w:before="170"/>
+      </w:pPr>
+      <w:r>
+        <w:rPr>
+          <w:b/>
+          <w:bCs/>
+          <w:color w:val="172837"/>
+          <w:sz w:val="24"/>
+          <w:szCs w:val="24"/>
+        </w:rPr>
+        <w:t xml:space="preserve">Art. 9 — Durata e risoluzione</w:t>
+      </w:r>
+    </w:p>
+    <w:p>
+      <w:pPr>
+        <w:spacing w:after="90"/>
+        <w:ind w:left="400" w:hanging="400"/>
+      </w:pPr>
+      <w:r>
+        <w:rPr>
+          <w:b/>
+          <w:bCs/>
+          <w:i w:val="false"/>
+          <w:iCs w:val="false"/>
+          <w:color w:val="222222"/>
+          <w:sz w:val="20"/>
+          <w:szCs w:val="20"/>
+        </w:rPr>
+        <w:t xml:space="preserve">9.1. Il presente accordo ha durata fissa di 6 (sei) mesi a decorrere dalla data di sottoscrizione, rinnovabile per ulteriori periodi di 6 mesi previo accordo scritto tra le parti. In assenza di tale accordo scritto, il rapporto si intende cessato alla naturale scadenza, senza necessità di alcuna comunicazione. Ciascuna Parte può inoltre interrompere la collaborazione in qualsiasi momento, senza necessità di motivazione né di preavviso, mediante comunicazione al Coordinatore tramite l'apposita funzione del gestionale (che registra data e ora in modo inalterabile), PEC o email.</w:t>
+      </w:r>
+    </w:p>
+    <w:p>
+      <w:pPr>
+        <w:spacing w:after="70"/>
+        <w:ind w:left="400" w:hanging="400"/>
+      </w:pPr>
+      <w:r>
+        <w:rPr>
+          <w:color w:val="222222"/>
+          <w:sz w:val="20"/>
+          <w:szCs w:val="20"/>
+        </w:rPr>
+        <w:t xml:space="preserve">9.2. In caso di recesso, il Collaboratore si impegna a collaborare, per quanto ragionevolmente possibile, a una transizione ordinata dei contenuti in corso di realizzazione al momento del recesso.</w:t>
+      </w:r>
+    </w:p>
+    <w:p>
+      <w:pPr>
+        <w:spacing w:after="70"/>
+        <w:ind w:left="400" w:hanging="400"/>
+      </w:pPr>
+      <w:r>
+        <w:rPr>
+          <w:color w:val="222222"/>
+          <w:sz w:val="20"/>
+          <w:szCs w:val="20"/>
+        </w:rPr>
+        <w:t xml:space="preserve">9.3. Anche il Coordinatore può interrompere la collaborazione con un singolo Collaboratore in qualsiasi momento, con comunicazione scritta, senza necessità di indicare un inadempimento specifico.</w:t>
+      </w:r>
+    </w:p>
+    <w:p>
+      <w:pPr>
+        <w:spacing w:after="70"/>
+        <w:ind w:left="400" w:hanging="400"/>
+      </w:pPr>
+      <w:r>
+        <w:rPr>
+          <w:color w:val="222222"/>
+          <w:sz w:val="20"/>
+          <w:szCs w:val="20"/>
+        </w:rPr>
+        <w:t xml:space="preserve">9.4. Alla scadenza naturale del termine di cui all'art. 9.1, o in caso di cessazione anticipata ai sensi del presente articolo, il Collaboratore procede alla cancellazione definitiva di qualsiasi copia locale dei materiali grezzi, dei recapiti e degli altri dati personali di terzi ancora in suo possesso, entro 24 (ventiquattro) ore dalla data di cessazione, dandone comunicazione al Coordinatore.</w:t>
+      </w:r>
+    </w:p>
+    <w:p>
+      <w:pPr>
+        <w:spacing w:after="70" w:before="170"/>
+      </w:pPr>
+      <w:r>
+        <w:rPr>
+          <w:b/>
+          <w:bCs/>
+          <w:color w:val="172837"/>
+          <w:sz w:val="24"/>
+          <w:szCs w:val="24"/>
+        </w:rPr>
+        <w:t xml:space="preserve">Art. 10 — Comunicazioni</w:t>
+      </w:r>
+    </w:p>
+    <w:p>
+      <w:pPr>
+        <w:spacing w:after="70"/>
+        <w:ind w:left="400" w:hanging="400"/>
+      </w:pPr>
+      <w:r>
+        <w:rPr>
+          <w:color w:val="222222"/>
+          <w:sz w:val="20"/>
+          <w:szCs w:val="20"/>
+        </w:rPr>
+        <w:t xml:space="preserve">10.1. Tutte le comunicazioni tra le parti relative al presente accordo (incluse le richieste di recesso, risoluzione, rettifica dei dati) potranno essere effettuate tramite la funzione del gestionale, tramite Posta Elettronica Certificata (PEC) o tramite posta elettronica ordinaria, secondo il recapito registrato da ciascuna parte presso il Progetto.</w:t>
+      </w:r>
+    </w:p>
+    <w:p>
+      <w:pPr>
+        <w:spacing w:after="70"/>
+        <w:ind w:left="400" w:hanging="400"/>
+      </w:pPr>
+      <w:r>
+        <w:rPr>
+          <w:color w:val="222222"/>
+          <w:sz w:val="20"/>
+          <w:szCs w:val="20"/>
+        </w:rPr>
+        <w:t xml:space="preserve">10.2. La PEC non è obbligatoria per il Collaboratore. Il Collaboratore può comunicare tramite il proprio indirizzo email personale; l'uso della PEC è facoltativo e riservato a chi intenda avvalersi della certificazione di consegna.</w:t>
+      </w:r>
+    </w:p>
+    <w:p>
+      <w:pPr>
+        <w:spacing w:after="70" w:before="170"/>
+      </w:pPr>
+      <w:r>
+        <w:rPr>
+          <w:b/>
+          <w:bCs/>
+          <w:color w:val="172837"/>
+          <w:sz w:val="24"/>
+          <w:szCs w:val="24"/>
+        </w:rPr>
+        <w:t xml:space="preserve">Art. 11 — Responsabilità civile verso terzi</w:t>
+      </w:r>
+    </w:p>
+    <w:p>
+      <w:pPr>
+        <w:spacing w:after="70"/>
+        <w:ind w:left="400" w:hanging="400"/>
+      </w:pPr>
+      <w:r>
+        <w:rPr>
+          <w:color w:val="222222"/>
+          <w:sz w:val="20"/>
+          <w:szCs w:val="20"/>
+        </w:rPr>
+        <w:t xml:space="preserve">11.1. Il Collaboratore dichiara di essere consapevole che, nello svolgimento delle attività di ripresa e intervista, potrebbe entrare in contatto con terzi e beni, e si impegna a prestare la massima diligenza e cautela, conformemente all'art. 1176 del Codice Civile.</w:t>
+      </w:r>
+    </w:p>
+    <w:p>
+      <w:pPr>
+        <w:spacing w:after="70"/>
+        <w:ind w:left="400" w:hanging="400"/>
+      </w:pPr>
+      <w:r>
+        <w:rPr>
+          <w:color w:val="222222"/>
+          <w:sz w:val="20"/>
+          <w:szCs w:val="20"/>
+        </w:rPr>
+        <w:t xml:space="preserve">11.2. Il Progetto non risponde dei danni cagionati a terzi dal Collaboratore, fatti salvi i casi di colpa grave o dolo del Coordinatore. Il Collaboratore si obbliga a tenere indenne e manlevare il Progetto da eventuali pretese risarcitorie avanzate da terzi per fatti a lui imputabili nello svolgimento delle attività di cui al presente accordo.</w:t>
+      </w:r>
+    </w:p>
+    <w:p>
+      <w:pPr>
+        <w:spacing w:after="70"/>
+        <w:ind w:left="400" w:hanging="400"/>
+      </w:pPr>
+      <w:r>
+        <w:rPr>
+          <w:color w:val="222222"/>
+          <w:sz w:val="20"/>
+          <w:szCs w:val="20"/>
+        </w:rPr>
+        <w:t xml:space="preserve">11.3. Il Collaboratore è consapevole che il Progetto non fornisce copertura assicurativa per la responsabilità civile verso terzi, e che eventuali sinistri occorsi durante le attività di ripresa restano di esclusiva responsabilità del Collaboratore stesso.</w:t>
+      </w:r>
+    </w:p>
+    <w:p>
+      <w:pPr>
+        <w:spacing w:after="40" w:before="110"/>
+      </w:pPr>
+      <w:r>
+        <w:rPr>
+          <w:b/>
+          <w:bCs/>
+          <w:color w:val="172837"/>
+          <w:sz w:val="20"/>
+          <w:szCs w:val="20"/>
+        </w:rPr>
+        <w:t xml:space="preserve">DISPOSIZIONI A TUTELA DEL PROGETTO</w:t>
+      </w:r>
+    </w:p>
+    <w:p>
+      <w:pPr>
+        <w:spacing w:after="70" w:before="170"/>
+      </w:pPr>
+      <w:r>
+        <w:rPr>
+          <w:b/>
+          <w:bCs/>
+          <w:color w:val="172837"/>
+          <w:sz w:val="24"/>
+          <w:szCs w:val="24"/>
+        </w:rPr>
+        <w:t xml:space="preserve">Art. 12 — Marchio, denominazione e materiali del Progetto</w:t>
+      </w:r>
+    </w:p>
+    <w:p>
+      <w:pPr>
+        <w:spacing w:after="70"/>
+        <w:ind w:left="400" w:hanging="400"/>
+      </w:pPr>
+      <w:r>
+        <w:rPr>
+          <w:color w:val="222222"/>
+          <w:sz w:val="20"/>
+          <w:szCs w:val="20"/>
+        </w:rPr>
+        <w:t xml:space="preserve">12.1. Il presente accordo non attribuisce al Collaboratore alcun diritto di proprietà o di uso esclusivo sulla denominazione "</w:t>
+      </w:r>
+      <w:r>
+        <w:rPr>
+          <w:color w:val="222222"/>
+          <w:sz w:val="20"/>
+          <w:szCs w:val="20"/>
+        </w:rPr>
+        <w:t xml:space="preserve">Tooth Talk</w:t>
+      </w:r>
+      <w:r>
+        <w:rPr>
+          <w:color w:val="222222"/>
+          <w:sz w:val="20"/>
+          <w:szCs w:val="20"/>
+          <w:vertAlign w:val="superscript"/>
+        </w:rPr>
+        <w:t xml:space="preserve">™</w:t>
+      </w:r>
+      <w:r>
+        <w:rPr>
+          <w:color w:val="222222"/>
+          <w:sz w:val="20"/>
+          <w:szCs w:val="20"/>
+        </w:rPr>
+        <w:t xml:space="preserve">", sul marchio figurativo registrato all'Ufficio Italiano Brevetti e Marchi al n. 302025000163999, sul marchio denominativo "</w:t>
+      </w:r>
+      <w:r>
+        <w:rPr>
+          <w:color w:val="222222"/>
+          <w:sz w:val="20"/>
+          <w:szCs w:val="20"/>
+        </w:rPr>
+        <w:t xml:space="preserve">Tooth Talk</w:t>
+      </w:r>
+      <w:r>
+        <w:rPr>
+          <w:color w:val="222222"/>
+          <w:sz w:val="20"/>
+          <w:szCs w:val="20"/>
+          <w:vertAlign w:val="superscript"/>
+        </w:rPr>
+        <w:t xml:space="preserve">™</w:t>
+      </w:r>
+      <w:r>
+        <w:rPr>
+          <w:color w:val="222222"/>
+          <w:sz w:val="20"/>
+          <w:szCs w:val="20"/>
+        </w:rPr>
+        <w:t xml:space="preserve">" (in corso di registrazione presso il medesimo Ufficio), sui format o sui canali del Progetto.</w:t>
+      </w:r>
+    </w:p>
+    <w:p>
+      <w:pPr>
+        <w:spacing w:after="70"/>
+        <w:ind w:left="400" w:hanging="400"/>
+      </w:pPr>
+      <w:r>
+        <w:rPr>
+          <w:color w:val="222222"/>
+          <w:sz w:val="20"/>
+          <w:szCs w:val="20"/>
+        </w:rPr>
+        <w:t xml:space="preserve">12.2. Senza autorizzazione scritta del Coordinatore, il Collaboratore non può:</w:t>
       </w:r>
     </w:p>
     <w:p>
@@ -1528,50 +1526,32 @@
           <w:sz w:val="20"/>
           <w:szCs w:val="20"/>
         </w:rPr>
-        <w:t xml:space="preserve">condividere le proprie credenziali di accesso al gestionale.</w:t>
-      </w:r>
-    </w:p>
-    <w:p>
-      <w:pPr>
-        <w:spacing w:after="70"/>
-        <w:ind w:left="400" w:hanging="400"/>
-      </w:pPr>
-      <w:r>
-        <w:rPr>
-          <w:color w:val="222222"/>
-          <w:sz w:val="20"/>
-          <w:szCs w:val="20"/>
-        </w:rPr>
-        <w:t xml:space="preserve">12.3. Alla cessazione della collaborazione, gli eventuali accessi devono essere restituiti o revocati e i materiali riservati cancellati, secondo quanto previsto dal presente Accordo e dal Protocollo Operativo.</w:t>
-      </w:r>
-    </w:p>
-    <w:p>
-      <w:pPr>
-        <w:spacing w:after="70" w:before="170"/>
-      </w:pPr>
-      <w:r>
-        <w:rPr>
-          <w:b/>
-          <w:bCs/>
-          <w:color w:val="172837"/>
-          <w:sz w:val="24"/>
-          <w:szCs w:val="24"/>
-        </w:rPr>
-        <w:t xml:space="preserve">Art. 13 — Riservatezza</w:t>
-      </w:r>
-    </w:p>
-    <w:p>
-      <w:pPr>
-        <w:spacing w:after="70"/>
-        <w:ind w:left="400" w:hanging="400"/>
-      </w:pPr>
-      <w:r>
-        <w:rPr>
-          <w:color w:val="222222"/>
-          <w:sz w:val="20"/>
-          <w:szCs w:val="20"/>
-        </w:rPr>
-        <w:t xml:space="preserve">13.1. Sono considerate informazioni riservate del Progetto, a titolo esemplificativo:</w:t>
+        <w:t xml:space="preserve">aprire profili o pagine utilizzando il nome o il logo "</w:t>
+      </w:r>
+      <w:r>
+        <w:rPr>
+          <w:color w:val="222222"/>
+          <w:sz w:val="20"/>
+          <w:szCs w:val="20"/>
+        </w:rPr>
+        <w:t xml:space="preserve">Tooth Talk</w:t>
+      </w:r>
+      <w:r>
+        <w:rPr>
+          <w:color w:val="222222"/>
+          <w:sz w:val="20"/>
+          <w:szCs w:val="20"/>
+          <w:vertAlign w:val="superscript"/>
+        </w:rPr>
+        <w:t xml:space="preserve">™</w:t>
+      </w:r>
+      <w:r>
+        <w:rPr>
+          <w:color w:val="222222"/>
+          <w:sz w:val="20"/>
+          <w:szCs w:val="20"/>
+        </w:rPr>
+        <w:t xml:space="preserve">";</w:t>
       </w:r>
     </w:p>
     <w:p>
@@ -1589,7 +1569,7 @@
           <w:sz w:val="20"/>
           <w:szCs w:val="20"/>
         </w:rPr>
-        <w:t xml:space="preserve">copioni e contenuti non ancora pubblicati;</w:t>
+        <w:t xml:space="preserve">registrare domini, marchi o segni simili o confondibili con quelli del Progetto;</w:t>
       </w:r>
     </w:p>
     <w:p>
@@ -1607,7 +1587,7 @@
           <w:sz w:val="20"/>
           <w:szCs w:val="20"/>
         </w:rPr>
-        <w:t xml:space="preserve">format, template, procedure e metodi produttivi;</w:t>
+        <w:t xml:space="preserve">concedere a terzi l'uso dei materiali del Progetto;</w:t>
       </w:r>
     </w:p>
     <w:p>
@@ -1625,7 +1605,7 @@
           <w:sz w:val="20"/>
           <w:szCs w:val="20"/>
         </w:rPr>
-        <w:t xml:space="preserve">credenziali, accessi e dati dei canali;</w:t>
+        <w:t xml:space="preserve">pubblicare autonomamente contenuti non ancora approvati secondo la procedura di sigillo di cui al Protocollo Operativo;</w:t>
       </w:r>
     </w:p>
     <w:p>
@@ -1643,7 +1623,50 @@
           <w:sz w:val="20"/>
           <w:szCs w:val="20"/>
         </w:rPr>
-        <w:t xml:space="preserve">statistiche, analisi e strategie editoriali;</w:t>
+        <w:t xml:space="preserve">condividere le proprie credenziali di accesso al gestionale.</w:t>
+      </w:r>
+    </w:p>
+    <w:p>
+      <w:pPr>
+        <w:spacing w:after="70"/>
+        <w:ind w:left="400" w:hanging="400"/>
+      </w:pPr>
+      <w:r>
+        <w:rPr>
+          <w:color w:val="222222"/>
+          <w:sz w:val="20"/>
+          <w:szCs w:val="20"/>
+        </w:rPr>
+        <w:t xml:space="preserve">12.3. Alla cessazione della collaborazione, gli eventuali accessi devono essere restituiti o revocati e i materiali riservati cancellati, secondo quanto previsto dal presente Accordo e dal Protocollo Operativo.</w:t>
+      </w:r>
+    </w:p>
+    <w:p>
+      <w:pPr>
+        <w:spacing w:after="70" w:before="170"/>
+      </w:pPr>
+      <w:r>
+        <w:rPr>
+          <w:b/>
+          <w:bCs/>
+          <w:color w:val="172837"/>
+          <w:sz w:val="24"/>
+          <w:szCs w:val="24"/>
+        </w:rPr>
+        <w:t xml:space="preserve">Art. 13 — Riservatezza</w:t>
+      </w:r>
+    </w:p>
+    <w:p>
+      <w:pPr>
+        <w:spacing w:after="70"/>
+        <w:ind w:left="400" w:hanging="400"/>
+      </w:pPr>
+      <w:r>
+        <w:rPr>
+          <w:color w:val="222222"/>
+          <w:sz w:val="20"/>
+          <w:szCs w:val="20"/>
+        </w:rPr>
+        <w:t xml:space="preserve">13.1. Sono considerate informazioni riservate del Progetto, a titolo esemplificativo:</w:t>
       </w:r>
     </w:p>
     <w:p>
@@ -1661,7 +1684,7 @@
           <w:sz w:val="20"/>
           <w:szCs w:val="20"/>
         </w:rPr>
-        <w:t xml:space="preserve">dati economici del Progetto;</w:t>
+        <w:t xml:space="preserve">copioni e contenuti non ancora pubblicati;</w:t>
       </w:r>
     </w:p>
     <w:p>
@@ -1679,7 +1702,7 @@
           <w:sz w:val="20"/>
           <w:szCs w:val="20"/>
         </w:rPr>
-        <w:t xml:space="preserve">contatti di Collaboratori, professionisti e potenziali sponsor;</w:t>
+        <w:t xml:space="preserve">format, template, procedure e metodi produttivi;</w:t>
       </w:r>
     </w:p>
     <w:p>
@@ -1697,6 +1720,78 @@
           <w:sz w:val="20"/>
           <w:szCs w:val="20"/>
         </w:rPr>
+        <w:t xml:space="preserve">credenziali, accessi e dati dei canali;</w:t>
+      </w:r>
+    </w:p>
+    <w:p>
+      <w:pPr>
+        <w:pStyle w:val="ListParagraph"/>
+        <w:numPr>
+          <w:ilvl w:val="0"/>
+          <w:numId w:val="2"/>
+        </w:numPr>
+        <w:spacing w:after="50"/>
+      </w:pPr>
+      <w:r>
+        <w:rPr>
+          <w:color w:val="222222"/>
+          <w:sz w:val="20"/>
+          <w:szCs w:val="20"/>
+        </w:rPr>
+        <w:t xml:space="preserve">statistiche, analisi e strategie editoriali;</w:t>
+      </w:r>
+    </w:p>
+    <w:p>
+      <w:pPr>
+        <w:pStyle w:val="ListParagraph"/>
+        <w:numPr>
+          <w:ilvl w:val="0"/>
+          <w:numId w:val="2"/>
+        </w:numPr>
+        <w:spacing w:after="50"/>
+      </w:pPr>
+      <w:r>
+        <w:rPr>
+          <w:color w:val="222222"/>
+          <w:sz w:val="20"/>
+          <w:szCs w:val="20"/>
+        </w:rPr>
+        <w:t xml:space="preserve">dati economici del Progetto;</w:t>
+      </w:r>
+    </w:p>
+    <w:p>
+      <w:pPr>
+        <w:pStyle w:val="ListParagraph"/>
+        <w:numPr>
+          <w:ilvl w:val="0"/>
+          <w:numId w:val="2"/>
+        </w:numPr>
+        <w:spacing w:after="50"/>
+      </w:pPr>
+      <w:r>
+        <w:rPr>
+          <w:color w:val="222222"/>
+          <w:sz w:val="20"/>
+          <w:szCs w:val="20"/>
+        </w:rPr>
+        <w:t xml:space="preserve">contatti di Collaboratori, professionisti e potenziali sponsor;</w:t>
+      </w:r>
+    </w:p>
+    <w:p>
+      <w:pPr>
+        <w:pStyle w:val="ListParagraph"/>
+        <w:numPr>
+          <w:ilvl w:val="0"/>
+          <w:numId w:val="2"/>
+        </w:numPr>
+        <w:spacing w:after="50"/>
+      </w:pPr>
+      <w:r>
+        <w:rPr>
+          <w:color w:val="222222"/>
+          <w:sz w:val="20"/>
+          <w:szCs w:val="20"/>
+        </w:rPr>
         <w:t xml:space="preserve">informazioni personali o professionali ricevute nell'ambito della collaborazione.</w:t>
       </w:r>
     </w:p>
@@ -1941,6 +2036,7 @@
     </w:p>
     <w:p>
       <w:pPr>
+        <w:keepNext/>
         <w:spacing w:after="200" w:before="300"/>
       </w:pPr>
       <w:r>
@@ -1954,6 +2050,7 @@
     </w:p>
     <w:p>
       <w:pPr>
+        <w:keepNext/>
         <w:spacing w:after="160"/>
       </w:pPr>
       <w:r>
@@ -1967,6 +2064,7 @@
     </w:p>
     <w:p>
       <w:pPr>
+        <w:keepNext/>
         <w:spacing w:after="160"/>
       </w:pPr>
       <w:r>
@@ -2020,7 +2118,7 @@
       <w:headerReference w:type="default" r:id="rId7"/>
       <w:footerReference w:type="default" r:id="rId8"/>
       <w:pgSz w:w="11906" w:h="16838" w:orient="portrait"/>
-      <w:pgMar w:top="1440" w:right="1440" w:bottom="1440" w:left="1440" w:header="708" w:footer="708" w:gutter="0"/>
+      <w:pgMar w:top="1900" w:right="1000" w:bottom="700" w:left="1000" w:header="200" w:footer="340" w:gutter="0"/>
       <w:pgNumType/>
       <w:docGrid w:linePitch="360"/>
     </w:sectPr>
@@ -2156,13 +2254,13 @@
 <w:hdr xmlns:wpc="http://schemas.microsoft.com/office/word/2010/wordprocessingCanvas" xmlns:mc="http://schemas.openxmlformats.org/markup-compatibility/2006" xmlns:o="urn:schemas-microsoft-com:office:office" xmlns:r="http://schemas.openxmlformats.org/officeDocument/2006/relationships" xmlns:m="http://schemas.openxmlformats.org/officeDocument/2006/math" xmlns:v="urn:schemas-microsoft-com:vml" xmlns:wp14="http://schemas.microsoft.com/office/word/2010/wordprocessingDrawing" xmlns:wp="http://schemas.openxmlformats.org/drawingml/2006/wordprocessingDrawing" xmlns:w10="urn:schemas-microsoft-com:office:word" xmlns:w="http://schemas.openxmlformats.org/wordprocessingml/2006/main" xmlns:w14="http://schemas.microsoft.com/office/word/2010/wordml" xmlns:w15="http://schemas.microsoft.com/office/word/2012/wordml" xmlns:wpg="http://schemas.microsoft.com/office/word/2010/wordprocessingGroup" xmlns:wpi="http://schemas.microsoft.com/office/word/2010/wordprocessingInk" xmlns:wne="http://schemas.microsoft.com/office/word/2006/wordml" xmlns:wps="http://schemas.microsoft.com/office/word/2010/wordprocessingShape" xmlns:cx="http://schemas.microsoft.com/office/drawing/2014/chartex" xmlns:cx1="http://schemas.microsoft.com/office/drawing/2015/9/8/chartex" xmlns:cx2="http://schemas.microsoft.com/office/drawing/2015/10/21/chartex" xmlns:cx3="http://schemas.microsoft.com/office/drawing/2016/5/9/chartex" xmlns:cx4="http://schemas.microsoft.com/office/drawing/2016/5/10/chartex" xmlns:cx5="http://schemas.microsoft.com/office/drawing/2016/5/11/chartex" xmlns:cx6="http://schemas.microsoft.com/office/drawing/2016/5/12/chartex" xmlns:cx7="http://schemas.microsoft.com/office/drawing/2016/5/13/chartex" xmlns:cx8="http://schemas.microsoft.com/office/drawing/2016/5/14/chartex" xmlns:w16cid="http://schemas.microsoft.com/office/word/2016/wordml/cid" xmlns:w16se="http://schemas.microsoft.com/office/word/2015/wordml/symex">
   <w:p>
     <w:pPr>
-      <w:spacing w:after="60" w:before="0"/>
+      <w:spacing w:after="60" w:before="750"/>
       <w:jc w:val="left"/>
     </w:pPr>
     <w:r>
       <w:drawing>
         <wp:inline distT="0" distB="0" distL="0" distR="0">
-          <wp:extent cx="1809750" cy="419100"/>
+          <wp:extent cx="2047875" cy="476250"/>
           <wp:effectExtent t="0" r="0" b="0" l="0"/>
           <wp:docPr id="1" name="" descr="" title=""/>
           <wp:cNvGraphicFramePr>
@@ -2187,7 +2285,7 @@
                 <pic:spPr bwMode="auto">
                   <a:xfrm>
                     <a:off x="0" y="0"/>
-                    <a:ext cx="1809750" cy="419100"/>
+                    <a:ext cx="2047875" cy="476250"/>
                   </a:xfrm>
                   <a:prstGeom prst="rect">
                     <a:avLst/>

</xml_diff>

<commit_message>
feat(privacy): Protocollo Operativo allegato all'accordo, testi 'letto e compreso' allineati, documenti ufficiali aggiornati
- approvaRegistrazione: allegato automatico public/documenti/3-protocollo-operativo.pdf
  all'email con l'accordo da firmare (incorporazione per richiamo Art. 13.1 del
  Protocollo); fail-closed se il file non è leggibile dal server
- checkbox 'ho letto e compreso' (ProfiloPersonale) e PEC al Titolare ora citano
  l'accordo editoriale e il Protocollo Operativo ad esso allegato
- generaModuloNomina: 48 ore nei termini di custodia/cancellazione e nuova
  descrizione del video di dichiarazione autonomo (Art. 4.1 Protocollo)
- PDF ufficiali dei 4 documenti aggiunti in public/documenti/
- modello_accordo: nuovo modello attivo = solo Accordo editoriale (SHA f686ac7a)
</commit_message>
<xml_diff>
--- a/public/documenti/1-accordo-editoriale.docx
+++ b/public/documenti/1-accordo-editoriale.docx
@@ -574,6 +574,56 @@
     </w:p>
     <w:p>
       <w:pPr>
+        <w:spacing w:after="70"/>
+        <w:ind w:left="400" w:hanging="400"/>
+      </w:pPr>
+      <w:r>
+        <w:rPr>
+          <w:color w:val="222222"/>
+          <w:sz w:val="20"/>
+          <w:szCs w:val="20"/>
+        </w:rPr>
+        <w:t>4.5. Il Collaboratore può ripubblicare, esclusivamente sul proprio profilo social personale e per la sola durata della collaborazione, i contenuti in cui appare (ad esempio taggandosi nei video pubblicati dal Progetto), a condizione che ne sia indicata la provenienza dal Progetto “Tooth Talk™” e che il contenuto non venga alterato rispetto alla versione pubblicata dal Progetto. Il Collaboratore non può pubblicare autonomamente, su altri canali o piattaforme, i contenuti (video, audio, fotografie) realizzati nell'ambito del Progetto, né utilizzarli per finalità diverse da quelle editoriali del Progetto, salvo autorizzazione scritta del Coordinatore.</w:t>
+      </w:r>
+    </w:p>
+    <w:p>
+      <w:pPr>
+        <w:spacing w:after="70"/>
+        <w:ind w:left="400" w:hanging="400"/>
+      </w:pPr>
+      <w:r>
+        <w:rPr>
+          <w:color w:val="222222"/>
+          <w:sz w:val="20"/>
+          <w:szCs w:val="20"/>
+        </w:rPr>
+        <w:t xml:space="preserve">4.6. La facoltà di cui all'art. 4.5 è legata alla collaborazione in corso: alla cessazione della collaborazione, per qualsiasi causa, il Collaboratore non può ripubblicare ulteriori contenuti del Progetto. </w:t>
+      </w:r>
+      <w:r>
+        <w:rPr>
+          <w:b/>
+          <w:color w:val="222222"/>
+          <w:sz w:val="20"/>
+        </w:rPr>
+        <w:t>Qualora un contenuto pubblicato venga rimosso o oscurato dal Progetto a seguito di una richiesta di rimozione accolta ai sensi dell'Art. 8.3, il Collaboratore che lo avesse ripubblicato sul proprio profilo ai sensi dell'art. 4.5 si impegna a rimuoverlo a propria volta, senza ritardo ingiustificato: mantenere online un contenuto che il Progetto non può più diffondere costituirebbe un uso del marchio “Tooth Talk™” contrario alla volontà del suo titolare.</w:t>
+      </w:r>
+    </w:p>
+    <w:p>
+      <w:pPr>
+        <w:spacing w:after="70"/>
+        <w:ind w:left="400" w:hanging="400"/>
+      </w:pPr>
+      <w:r>
+        <w:rPr>
+          <w:color w:val="222222"/>
+          <w:sz w:val="20"/>
+          <w:szCs w:val="20"/>
+        </w:rPr>
+        <w:t>4.7. Qualora il Collaboratore gestisca canali social propri o partecipi ad altri progetti editoriali, può realizzare contenuti autonomi anche su tematiche affini a quelle trattate da “Tooth Talk™”, a condizione che il girato finale pubblicato non possa essere ricondotto — per elementi grafici, stilistici o di montaggio — a quelli utilizzati dal Progetto, e che non venga utilizzata la denominazione, il marchio o il logo “Tooth Talk™”.</w:t>
+      </w:r>
+    </w:p>
+    <w:p>
+      <w:pPr>
         <w:spacing w:after="70" w:before="170"/>
       </w:pPr>
       <w:r>
@@ -804,6 +854,26 @@
     </w:p>
     <w:p>
       <w:pPr>
+        <w:pStyle w:val="ListParagraph"/>
+        <w:numPr>
+          <w:ilvl w:val="0"/>
+          <w:numId w:val="2"/>
+        </w:numPr>
+        <w:spacing w:after="50"/>
+      </w:pPr>
+      <w:r>
+        <w:rPr>
+          <w:b/>
+          <w:bCs/>
+          <w:color w:val="222222"/>
+          <w:sz w:val="20"/>
+          <w:szCs w:val="20"/>
+        </w:rPr>
+        <w:t>qualora durante l'intervista emerga la necessità di porre una domanda non dichiarata nel video iniziale, integrare la dichiarazione con un nuovo video che includa anche la domanda aggiuntiva prima del sigillo del pacchetto: le risposte a domande non coperte da alcuna dichiarazione di consenso non possono essere utilizzate né incluse nel contenuto pubblicato, secondo le modalità descritte nel Protocollo Operativo (Art. 4.1).</w:t>
+      </w:r>
+    </w:p>
+    <w:p>
+      <w:pPr>
         <w:spacing w:after="40" w:before="110"/>
       </w:pPr>
       <w:r>
@@ -883,7 +953,7 @@
           <w:sz w:val="20"/>
           <w:szCs w:val="20"/>
         </w:rPr>
-        <w:t xml:space="preserve">cancellare la copia locale (dal telefono, tablet, scheda SD, etc.) subito dopo la conferma di avvenuto caricamento sul gestionale, e comunque entro 24 (ventiquattro) ore dalla ricezione della conferma di caricamento da parte del gestionale;</w:t>
+        <w:t>cancellare la copia locale (dal telefono, tablet, scheda SD, etc.) subito dopo la conferma di avvenuto caricamento sul gestionale, e comunque entro 48 (quarantotto) ore dalla ricezione della conferma di caricamento da parte del gestionale;</w:t>
       </w:r>
     </w:p>
     <w:p>
@@ -1300,7 +1370,7 @@
           <w:sz w:val="20"/>
           <w:szCs w:val="20"/>
         </w:rPr>
-        <w:t xml:space="preserve">9.4. Alla scadenza naturale del termine di cui all'art. 9.1, o in caso di cessazione anticipata ai sensi del presente articolo, il Collaboratore procede alla cancellazione definitiva di qualsiasi copia locale dei materiali grezzi, dei recapiti e degli altri dati personali di terzi ancora in suo possesso, entro 24 (ventiquattro) ore dalla data di cessazione, dandone comunicazione al Coordinatore.</w:t>
+        <w:t>9.4. Alla scadenza naturale del termine di cui all'art. 9.1, o in caso di cessazione anticipata ai sensi del presente articolo, il Collaboratore procede alla cancellazione definitiva di qualsiasi copia locale dei materiali grezzi, dei recapiti e degli altri dati personali di terzi ancora in suo possesso, entro 48 (quarantotto) ore dalla data di cessazione, dandone comunicazione al Coordinatore.</w:t>
       </w:r>
     </w:p>
     <w:p>

</xml_diff>

<commit_message>
feat(privacy): conferma Art. 9.4 cancellazione copie locali alla cessazione
- terminaCollaborazione/eliminaAccount avviano la richiesta di conferma (48h)
- pagina /uscita con conferma autonoma: checkbox Art. 9.4, registrata in
  audit_log (azione conferma_cancellazione_copie) con data e ora
- accesso ai propri documenti preservato a prescindere dalla conferma
  (accordo firmato, modulo di nomina, portabilità art. 20 GDPR) — punto b
  della revisione legale
- profili uscenti: stato conferma visibile all'admin (in attesa / ricevuta /
  non ricevuta oltre 48h), nessun blocco tecnico
- migrazione 0105 (2 campi su profiles) applicata al DB
- documenti ufficiali aggiornati (Accordo, Protocollo, Documento 2)
</commit_message>
<xml_diff>
--- a/public/documenti/1-accordo-editoriale.docx
+++ b/public/documenti/1-accordo-editoriale.docx
@@ -131,7 +131,7 @@
           <w:sz w:val="20"/>
           <w:szCs w:val="20"/>
         </w:rPr>
-        <w:t xml:space="preserve">Il/La sottoscritto/a ________________________________, nato/a a ________________ il ____________, residente in ________________________________________, C.F. ________________________________, studente/ssa del Corso di Laurea Magistrale in Odontoiatria e Protesi Dentaria presso l'Università degli Studi di ________________________ di matricola n. ____________ (di seguito "il Collaboratore")</w:t>
+        <w:t>Il/La sottoscritto/a ________________________________, nato/a a ________________ il ____________, residente in ________________________________________, C.F. ________________________________, studente/ssa universitario/a (di seguito "il Collaboratore")</w:t>
       </w:r>
     </w:p>
     <w:p>
@@ -410,6 +410,20 @@
     </w:p>
     <w:p>
       <w:pPr>
+        <w:spacing w:after="70"/>
+        <w:ind w:left="400" w:hanging="400"/>
+      </w:pPr>
+      <w:r>
+        <w:rPr>
+          <w:color w:val="222222"/>
+          <w:sz w:val="20"/>
+          <w:szCs w:val="20"/>
+        </w:rPr>
+        <w:t>2.4. Il Collaboratore dichiara di essere studente/ssa universitario/a e di partecipare al Progetto in tale veste, restando fermo quanto previsto all'art. 2.3: la collaborazione non dà diritto a riconoscimenti di crediti formativi universitari (CFU/ECTS) né a qualificazioni equivalenti.</w:t>
+      </w:r>
+    </w:p>
+    <w:p>
+      <w:pPr>
         <w:spacing w:after="70" w:before="170"/>
       </w:pPr>
       <w:r>
@@ -619,7 +633,7 @@
           <w:sz w:val="20"/>
           <w:szCs w:val="20"/>
         </w:rPr>
-        <w:t>4.7. Qualora il Collaboratore gestisca canali social propri o partecipi ad altri progetti editoriali, può realizzare contenuti autonomi anche su tematiche affini a quelle trattate da “Tooth Talk™”, a condizione che il girato finale pubblicato non possa essere ricondotto — per elementi grafici, stilistici o di montaggio — a quelli utilizzati dal Progetto, e che non venga utilizzata la denominazione, il marchio o il logo “Tooth Talk™”.</w:t>
+        <w:t>4.7. Qualora il Collaboratore gestisca canali social propri o partecipi ad altri progetti editoriali, può realizzare contenuti autonomi anche su tematiche affini a quelle trattate da “Tooth Talk™”, a condizione che il girato finale pubblicato non possa essere ricondotto — per elementi grafici, stilistici o di montaggio — a quelli utilizzati dal Progetto, e non possa ingenerare confusione circa la provenienza o l'affiliazione con “Tooth Talk™”, e che non venga utilizzata la denominazione, il marchio o il logo “Tooth Talk™”.</w:t>
       </w:r>
     </w:p>
     <w:p>

</xml_diff>

<commit_message>
docs: aggiornati Documento 1 (Accordo) e Documento 4 (Modulo nomina); incipit nomina allineato al docx
- Accordo: rimossa assunzione 'studente universitario' (ora condizionale) e
  preambolo riveduto
- Modulo di nomina: incipit riscritto 'il/la Collaboratore/trice ... quale
  persona autorizzata' (anche nel template generato da generaModuloNomina,
  che usava ancora la vecchia forma 'che ... è nominato/a')
</commit_message>
<xml_diff>
--- a/public/documenti/1-accordo-editoriale.docx
+++ b/public/documenti/1-accordo-editoriale.docx
@@ -131,7 +131,7 @@
           <w:sz w:val="20"/>
           <w:szCs w:val="20"/>
         </w:rPr>
-        <w:t>Il/La sottoscritto/a ________________________________, nato/a a ________________ il ____________, residente in ________________________________________, C.F. ________________________________, studente/ssa universitario/a (di seguito "il Collaboratore")</w:t>
+        <w:t>Il/La sottoscritto/a ________________________________, nato/a a ________________ il ____________, residente in ________________________________________, C.F. ________________________________ (di seguito "il Collaboratore")</w:t>
       </w:r>
     </w:p>
     <w:p>
@@ -419,7 +419,7 @@
           <w:sz w:val="20"/>
           <w:szCs w:val="20"/>
         </w:rPr>
-        <w:t>2.4. Il Collaboratore dichiara di essere studente/ssa universitario/a e di partecipare al Progetto in tale veste, restando fermo quanto previsto all'art. 2.3: la collaborazione non dà diritto a riconoscimenti di crediti formativi universitari (CFU/ECTS) né a qualificazioni equivalenti.</w:t>
+        <w:t>2.4. Qualora il Collaboratore sia, alla data di sottoscrizione, studente universitario/a, resta fermo quanto previsto all'art. 2.3: la partecipazione al Progetto in tale qualità non è in alcun caso configurabile come tirocinio curriculare o extracurriculare, stage o altra forma di alternanza scuola-lavoro, e non dà diritto al riconoscimento di crediti formativi universitari (CFU/ECTS) né di qualificazioni equivalenti, salvo diverso accordo scritto tra il Coordinatore e l'ateneo di appartenenza.</w:t>
       </w:r>
     </w:p>
     <w:p>

</xml_diff>

<commit_message>
fix(drive): backup accordi nella struttura corretta Gestione canale/accordi/polo; documento 1 aggiornato
- eliminata la gestione canale/accordi creata per errore dentro 'Archivio video'
- eliminato il duplicato 'Genova' (il polo ora punta alla cartella originale
  '1 - ToothTalk Genova', drive_folder_id aggiornato nel DB)
- archiviaAccordoSuDrive: destinazione 'Gestione canale/accordi/<polo>/Nome
  Cognome.pdf' (nome del Collaboratore dall'accordo/profilo), per tutti i poli
  di appartenenza dell'utente
- cartella 'Dichiarazioni' creata anche nel GESTIONE VIDEO di Genova originale
</commit_message>
<xml_diff>
--- a/public/documenti/1-accordo-editoriale.docx
+++ b/public/documenti/1-accordo-editoriale.docx
@@ -419,7 +419,7 @@
           <w:sz w:val="20"/>
           <w:szCs w:val="20"/>
         </w:rPr>
-        <w:t>2.4. Qualora il Collaboratore sia, alla data di sottoscrizione, studente universitario/a, resta fermo quanto previsto all'art. 2.3: la partecipazione al Progetto in tale qualità non è in alcun caso configurabile come tirocinio curriculare o extracurriculare, stage o altra forma di alternanza scuola-lavoro, e non dà diritto al riconoscimento di crediti formativi universitari (CFU/ECTS) né di qualificazioni equivalenti, salvo diverso accordo scritto tra il Coordinatore e l'ateneo di appartenenza.</w:t>
+        <w:t>2.4. Qualora il Collaboratore sia, alla data di sottoscrizione, iscritto/a a un percorso di studi o di formazione, resta fermo quanto previsto all'art. 2.3: la partecipazione al Progetto in tale qualità non è in alcun caso configurabile come tirocinio curriculare o extracurriculare, stage o altra forma di alternanza scuola-lavoro, e non dà diritto al riconoscimento di crediti formativi (CFU/ECTS) né di qualificazioni equivalenti.</w:t>
       </w:r>
     </w:p>
     <w:p>
@@ -448,7 +448,7 @@
           <w:sz w:val="20"/>
           <w:szCs w:val="20"/>
         </w:rPr>
-        <w:t xml:space="preserve">3.1. Il Collaboratore riconosce che la partecipazione al Progetto gli offre opportunità di rilievo sul piano formativo e professionale, ivi inclusi, a titolo esemplificativo: il consolidamento di rapporti extracurricolari con professori universitari e futuri colleghi odontoiatri; occasioni di apprendimento e approfondimento delle tematiche oggetto dei contenuti; visibilità e riconoscibilità nei contesti — nazionali, europei e internazionali — in cui i contenuti di "</w:t>
+        <w:t>3.1. Il Collaboratore riconosce che la partecipazione al Progetto gli offre opportunità di rilievo sul piano formativo e professionale, ivi inclusi, a titolo esemplificativo: il consolidamento di rapporti extracurricolari con docenti e professionisti del settore e futuri colleghi odontoiatri; occasioni di apprendimento e approfondimento delle tematiche oggetto dei contenuti; visibilità e riconoscibilità nei contesti — nazionali, europei e internazionali — in cui i contenuti di "</w:t>
       </w:r>
       <w:r>
         <w:rPr>

</xml_diff>

<commit_message>
docs(privacy): secondo fondamento giuridico (interesse legittimo art. 6.1.f) nell'informativa
- informativa-privacy.ts: nuova voce "Interesse legittimo" per il mantenimento
  online dei contenuti già pubblicati (funzione informativa/educativa, art. 21
  GDPR), distinta da quella esistente su PEC/registro append-only; paragrafo
  "Revoca del consenso" aggiornato: i contenuti pubblicati restano online anche
  sulla base del legittimo interesse, valutazione caso per caso con bilanciamento
  degli interessi e art. 17.3.
- RichiesteRimozionePubblicato.tsx (solo copy): bottone "Rifiutato (prevale
  l'interesse del Progetto)", testo allineato alla logica di bilanciamento.
- Documenti ufficiali (Accordo Art. 8.3, liberatoria terzi, Protocollo)
  allineati allo stesso doppio fondamento.
- Verifiche: tsc pulito, build ok, render di /privacy con i nuovi testi.
</commit_message>
<xml_diff>
--- a/public/documenti/1-accordo-editoriale.docx
+++ b/public/documenti/1-accordo-editoriale.docx
@@ -424,6 +424,20 @@
     </w:p>
     <w:p>
       <w:pPr>
+        <w:spacing w:after="70"/>
+        <w:ind w:left="400" w:hanging="400"/>
+      </w:pPr>
+      <w:r>
+        <w:rPr>
+          <w:color w:val="222222"/>
+          <w:sz w:val="20"/>
+          <w:szCs w:val="20"/>
+        </w:rPr>
+        <w:t>2.5. Il Collaboratore dichiara, sotto la propria responsabilità, di essere maggiorenne alla data di sottoscrizione del presente accordo.</w:t>
+      </w:r>
+    </w:p>
+    <w:p>
+      <w:pPr>
         <w:spacing w:after="70" w:before="170"/>
       </w:pPr>
       <w:r>
@@ -1297,7 +1311,7 @@
           <w:sz w:val="20"/>
           <w:szCs w:val="20"/>
         </w:rPr>
-        <w:t xml:space="preserve">8.3. Richiesta di rimozione di un contenuto già pubblicato: il Collaboratore, consapevole dell'impegno editoriale e organizzativo del Progetto, riconosce che la richiesta di rimozione di un contenuto già pubblicato è valutata caso per caso, alla luce delle finalità editoriali del Progetto e delle eccezioni previste dall'art. 17, par. 3, lett. a) del GDPR (libertà di espressione e informazione). </w:t>
+        <w:t xml:space="preserve">8.3. Richiesta di rimozione di un contenuto già pubblicato: la conservazione e diffusione di un contenuto già pubblicato si fonda, oltre che sul consenso prestato per l'atto di pubblicazione, sul legittimo interesse del Progetto (art. 6, par. 1, lett. f, GDPR) a mantenere accessibile un contenuto che continua a svolgere una funzione informativa ed educativa in ambito di prevenzione odontoiatrica. Il Collaboratore può opporsi in qualsiasi momento a tale trattamento ai sensi dell'art. 21 GDPR. Ricevuta una richiesta di rimozione o opposizione, il Coordinatore bilancia il legittimo interesse del Progetto con l'interesse del Collaboratore e valuta se ricorra una delle eccezioni previste dall'art. 17, par. 3, del GDPR. </w:t>
       </w:r>
       <w:r>
         <w:rPr>
@@ -1309,7 +1323,7 @@
           <w:sz w:val="20"/>
           <w:szCs w:val="20"/>
         </w:rPr>
-        <w:t xml:space="preserve">Il Coordinatore, ricevuta la richiesta di rimozione, valuterà se ricorra una delle eccezioni di cui all'art. 17, par. 3, GDPR. In assenza di tali eccezioni, il Coordinatore provvederà alla rimozione o all'oscuramento (camuffamento di volto/voce) del contenuto entro 30 (trenta) giorni, dandone comunicazione all'interessato. Qualora ricorra un'eccezione, il Coordinatore fornirà risposta motivata entro lo stesso termine. Il termine di 30 giorni è prorogabile a 90 (novanta) giorni con motivazione scritta, in relazione alla complessità della valutazione.</w:t>
+        <w:t>Se dal bilanciamento prevale l'interesse del Collaboratore e non ricorre alcuna eccezione, il Coordinatore provvede alla rimozione o all'oscuramento (camuffamento di volto/voce) del contenuto entro 30 (trenta) giorni, dandone comunicazione all'interessato; altrimenti, fornisce risposta motivata entro lo stesso termine. Il termine di 30 giorni è prorogabile a 90 (novanta) giorni con motivazione scritta, in relazione alla complessità della valutazione.</w:t>
       </w:r>
     </w:p>
     <w:p>
@@ -1384,7 +1398,7 @@
           <w:sz w:val="20"/>
           <w:szCs w:val="20"/>
         </w:rPr>
-        <w:t>9.4. Alla scadenza naturale del termine di cui all'art. 9.1, o in caso di cessazione anticipata ai sensi del presente articolo, il Collaboratore procede alla cancellazione definitiva di qualsiasi copia locale dei materiali grezzi, dei recapiti e degli altri dati personali di terzi ancora in suo possesso, entro 48 (quarantotto) ore dalla data di cessazione, dandone comunicazione al Coordinatore.</w:t>
+        <w:t>9.4. Alla scadenza naturale del termine di cui all'art. 9.1, o in caso di cessazione anticipata ai sensi del presente articolo, il Collaboratore procede alla cancellazione definitiva di qualsiasi copia locale dei materiali grezzi, dei recapiti e degli altri dati personali di terzi ancora in suo possesso, entro 48 (quarantotto) ore dalla data di cessazione, dandone comunicazione al Coordinatore tramite l'apposita funzione di conferma disponibile nel gestionale al momento dell'uscita, che registra la conferma con data e ora in modo inalterabile.</w:t>
       </w:r>
     </w:p>
     <w:p>

</xml_diff>